<commit_message>
📄 DOCX firmado: 43102351000116 - 17/4/2026, 4:43:16 p.m.
</commit_message>
<xml_diff>
--- a/data/declaraciones/signed/43102351000116.docx
+++ b/data/declaraciones/signed/43102351000116.docx
@@ -4262,7 +4262,7 @@
         <w:rPr>
           <w:lang w:val="es-MX"/>
         </w:rPr>
-        <w:t xml:space="preserve">FAROL INFLUENCIADORES LTDA</w:t>
+        <w:t xml:space="preserve">DANIEL ULIAN</w:t>
       </w:r>
       <w:proofErr w:type="spellStart"/>
       <w:r>
@@ -4457,7 +4457,7 @@
         <w:rPr>
           <w:lang w:val="es-MX"/>
         </w:rPr>
-        <w:t xml:space="preserve">: 10 de abril de 2026</w:t>
+        <w:t xml:space="preserve">: 17 de abril de 2026</w:t>
       </w:r>
       <w:proofErr w:type="spellStart"/>
       <w:r>

</xml_diff>